<commit_message>
atualizado o guia de preenchimento das mensagens do sistema
</commit_message>
<xml_diff>
--- a/docs/📘 Guia de Preenchimento das Mensagens do Sistema.docx
+++ b/docs/📘 Guia de Preenchimento das Mensagens do Sistema.docx
@@ -3499,6 +3499,143 @@
           <w:rtl w:val="0"/>
         </w:rPr>
         <w:t xml:space="preserve">Digite "menu" para voltar ao menu principal.</w:t>
+      </w:r>
+    </w:p>
+    <w:p>
+      <w:pPr>
+        <w:rPr/>
+      </w:pPr>
+      <w:r>
+        <w:rPr>
+          <w:rtl w:val="0"/>
+        </w:rPr>
+      </w:r>
+    </w:p>
+    <w:p>
+      <w:pPr>
+        <w:pStyle w:val="Heading2"/>
+        <w:keepNext w:val="0"/>
+        <w:keepLines w:val="0"/>
+        <w:spacing w:after="80" w:lineRule="auto"/>
+        <w:rPr/>
+      </w:pPr>
+      <w:bookmarkStart w:colFirst="0" w:colLast="0" w:name="_iz7eth793ezv" w:id="20"/>
+      <w:bookmarkEnd w:id="20"/>
+      <w:r>
+        <w:rPr>
+          <w:b w:val="1"/>
+          <w:sz w:val="34"/>
+          <w:szCs w:val="34"/>
+          <w:rtl w:val="0"/>
+        </w:rPr>
+        <w:t xml:space="preserve">19. AUDIO_INVITE</w:t>
+      </w:r>
+      <w:r>
+        <w:rPr>
+          <w:rtl w:val="0"/>
+        </w:rPr>
+      </w:r>
+    </w:p>
+    <w:p>
+      <w:pPr>
+        <w:spacing w:after="240" w:before="240" w:lineRule="auto"/>
+        <w:rPr/>
+      </w:pPr>
+      <w:r>
+        <w:rPr>
+          <w:b w:val="1"/>
+          <w:rtl w:val="0"/>
+        </w:rPr>
+        <w:t xml:space="preserve">Descrição:</w:t>
+      </w:r>
+      <w:r>
+        <w:rPr>
+          <w:rtl w:val="0"/>
+        </w:rPr>
+        <w:t xml:space="preserve">.Áudio que será enviado no final ao convidar para o grupo</w:t>
+        <w:br w:type="textWrapping"/>
+        <w:t xml:space="preserve"> </w:t>
+      </w:r>
+      <w:r>
+        <w:rPr>
+          <w:b w:val="1"/>
+          <w:rtl w:val="0"/>
+        </w:rPr>
+        <w:t xml:space="preserve">Variáveis:</w:t>
+      </w:r>
+      <w:r>
+        <w:rPr>
+          <w:rtl w:val="0"/>
+        </w:rPr>
+        <w:t xml:space="preserve"> Nenhuma.</w:t>
+      </w:r>
+    </w:p>
+    <w:p>
+      <w:pPr>
+        <w:rPr/>
+      </w:pPr>
+      <w:r>
+        <w:rPr>
+          <w:rtl w:val="0"/>
+        </w:rPr>
+      </w:r>
+    </w:p>
+    <w:p>
+      <w:pPr>
+        <w:pStyle w:val="Heading2"/>
+        <w:keepNext w:val="0"/>
+        <w:keepLines w:val="0"/>
+        <w:spacing w:after="80" w:lineRule="auto"/>
+        <w:rPr>
+          <w:b w:val="1"/>
+          <w:sz w:val="34"/>
+          <w:szCs w:val="34"/>
+        </w:rPr>
+      </w:pPr>
+      <w:bookmarkStart w:colFirst="0" w:colLast="0" w:name="_thkus4qmburj" w:id="21"/>
+      <w:bookmarkEnd w:id="21"/>
+      <w:r>
+        <w:rPr>
+          <w:b w:val="1"/>
+          <w:sz w:val="34"/>
+          <w:szCs w:val="34"/>
+          <w:rtl w:val="0"/>
+        </w:rPr>
+        <w:t xml:space="preserve">20. REMINDER</w:t>
+      </w:r>
+    </w:p>
+    <w:p>
+      <w:pPr>
+        <w:spacing w:after="240" w:before="240" w:lineRule="auto"/>
+        <w:rPr/>
+      </w:pPr>
+      <w:r>
+        <w:rPr>
+          <w:b w:val="1"/>
+          <w:rtl w:val="0"/>
+        </w:rPr>
+        <w:t xml:space="preserve">Descrição:</w:t>
+      </w:r>
+      <w:r>
+        <w:rPr>
+          <w:rtl w:val="0"/>
+        </w:rPr>
+        <w:t xml:space="preserve">.Mensagem que será mandada quando um evento estiver a 5 ou 3 dias, pode ser cadastrado mais de 1 o sistema irá escolher aleatóriamente entre as mensagens cadastradas sem repetir</w:t>
+        <w:br w:type="textWrapping"/>
+        <w:t xml:space="preserve"> </w:t>
+      </w:r>
+      <w:r>
+        <w:rPr>
+          <w:b w:val="1"/>
+          <w:rtl w:val="0"/>
+        </w:rPr>
+        <w:t xml:space="preserve">Variáveis:</w:t>
+      </w:r>
+      <w:r>
+        <w:rPr>
+          <w:rtl w:val="0"/>
+        </w:rPr>
+        <w:t xml:space="preserve"> Nenhuma.</w:t>
       </w:r>
     </w:p>
     <w:p>

</xml_diff>

<commit_message>
atualizado o Guia de prenchimento pra incluir o drone
</commit_message>
<xml_diff>
--- a/docs/📘 Guia de Preenchimento das Mensagens do Sistema.docx
+++ b/docs/📘 Guia de Preenchimento das Mensagens do Sistema.docx
@@ -3636,6 +3636,96 @@
           <w:rtl w:val="0"/>
         </w:rPr>
         <w:t xml:space="preserve"> Nenhuma.</w:t>
+      </w:r>
+    </w:p>
+    <w:p>
+      <w:pPr>
+        <w:pStyle w:val="Heading2"/>
+        <w:keepNext w:val="0"/>
+        <w:keepLines w:val="0"/>
+        <w:spacing w:after="80" w:lineRule="auto"/>
+        <w:rPr>
+          <w:b w:val="1"/>
+          <w:sz w:val="34"/>
+          <w:szCs w:val="34"/>
+        </w:rPr>
+      </w:pPr>
+      <w:bookmarkStart w:colFirst="0" w:colLast="0" w:name="_l4bldprps8pb" w:id="22"/>
+      <w:bookmarkEnd w:id="22"/>
+      <w:r>
+        <w:rPr>
+          <w:b w:val="1"/>
+          <w:sz w:val="34"/>
+          <w:szCs w:val="34"/>
+          <w:rtl w:val="0"/>
+        </w:rPr>
+        <w:t xml:space="preserve">20. DRONE</w:t>
+      </w:r>
+    </w:p>
+    <w:p>
+      <w:pPr>
+        <w:spacing w:after="240" w:before="240" w:lineRule="auto"/>
+        <w:rPr/>
+      </w:pPr>
+      <w:r>
+        <w:rPr>
+          <w:b w:val="1"/>
+          <w:rtl w:val="0"/>
+        </w:rPr>
+        <w:t xml:space="preserve">Descrição:</w:t>
+      </w:r>
+      <w:r>
+        <w:rPr>
+          <w:rtl w:val="0"/>
+        </w:rPr>
+        <w:t xml:space="preserve">.Mensagem que pode ser usada para ser disparada para os clientes quando quiser</w:t>
+      </w:r>
+    </w:p>
+    <w:p>
+      <w:pPr>
+        <w:spacing w:after="240" w:before="240" w:lineRule="auto"/>
+        <w:rPr/>
+      </w:pPr>
+      <w:r>
+        <w:rPr>
+          <w:rtl w:val="0"/>
+        </w:rPr>
+        <w:t xml:space="preserve"> </w:t>
+      </w:r>
+      <w:r>
+        <w:rPr>
+          <w:b w:val="1"/>
+          <w:rtl w:val="0"/>
+        </w:rPr>
+        <w:t xml:space="preserve">Variáveis:</w:t>
+      </w:r>
+      <w:r>
+        <w:rPr>
+          <w:rtl w:val="0"/>
+        </w:rPr>
+        <w:t xml:space="preserve"> {{name}}.</w:t>
+      </w:r>
+    </w:p>
+    <w:p>
+      <w:pPr>
+        <w:spacing w:after="240" w:before="240" w:lineRule="auto"/>
+        <w:rPr/>
+      </w:pPr>
+      <w:r>
+        <w:rPr>
+          <w:rtl w:val="0"/>
+        </w:rPr>
+      </w:r>
+    </w:p>
+    <w:p>
+      <w:pPr>
+        <w:spacing w:after="240" w:before="240" w:lineRule="auto"/>
+        <w:rPr/>
+      </w:pPr>
+      <w:r>
+        <w:rPr>
+          <w:rtl w:val="0"/>
+        </w:rPr>
       </w:r>
     </w:p>
     <w:p>

</xml_diff>